<commit_message>
Rename code to Nchat: packages uz.nchat, NchatApp, NchatCompany, NCoin, NStore
</commit_message>
<xml_diff>
--- a/docs/Nchat-Project-Description.docx
+++ b/docs/Nchat-Project-Description.docx
@@ -189,7 +189,7 @@
           <w:sz w:val="26"/>
           <w:szCs w:val="26"/>
         </w:rPr>
-        <w:t xml:space="preserve">Real-time chats · NixCoin wallet · Music · Games · NixStore</w:t>
+        <w:t xml:space="preserve">Real-time chats · NCoin wallet · Music · Games · NStore</w:t>
       </w:r>
     </w:p>
     <w:p>
@@ -479,7 +479,7 @@
         <w:t xml:space="preserve">Wallet —</w:t>
       </w:r>
       <w:r>
-        <w:t xml:space="preserve"> NixCoin, a virtual in-app currency friends send each other with a note.</w:t>
+        <w:t xml:space="preserve"> NCoin, a virtual in-app currency friends send each other with a note.</w:t>
       </w:r>
     </w:p>
     <w:p>
@@ -539,7 +539,7 @@
         <w:t xml:space="preserve">Store —</w:t>
       </w:r>
       <w:r>
-        <w:t xml:space="preserve"> NixStore, a catalog of mini-apps and bots to install, search and rate.</w:t>
+        <w:t xml:space="preserve"> NStore, a catalog of mini-apps and bots to install, search and rate.</w:t>
       </w:r>
     </w:p>
     <w:p>
@@ -567,7 +567,7 @@
         <w:spacing w:after="140" w:before="120"/>
       </w:pPr>
       <w:r>
-        <w:t xml:space="preserve">NixCoin is a virtual currency with no real-money value, so the Wallet service needs no banking license.</w:t>
+        <w:t xml:space="preserve">NCoin is a virtual currency with no real-money value, so the Wallet service needs no banking license.</w:t>
       </w:r>
     </w:p>
     <w:p>
@@ -820,7 +820,7 @@
                 <w:sz w:val="20"/>
                 <w:szCs w:val="20"/>
               </w:rPr>
-              <w:t xml:space="preserve">uz.nixchat.common.model</w:t>
+              <w:t xml:space="preserve">uz.nchat.common.model</w:t>
             </w:r>
           </w:p>
         </w:tc>
@@ -879,7 +879,7 @@
                 <w:sz w:val="20"/>
                 <w:szCs w:val="20"/>
               </w:rPr>
-              <w:t xml:space="preserve">NixCoin balances and transfers</w:t>
+              <w:t xml:space="preserve">NCoin balances and transfers</w:t>
             </w:r>
           </w:p>
         </w:tc>
@@ -906,7 +906,7 @@
                 <w:sz w:val="20"/>
                 <w:szCs w:val="20"/>
               </w:rPr>
-              <w:t xml:space="preserve">uz.nixchat.common.wallet</w:t>
+              <w:t xml:space="preserve">uz.nchat.common.wallet</w:t>
             </w:r>
           </w:p>
         </w:tc>
@@ -989,7 +989,7 @@
                 <w:sz w:val="20"/>
                 <w:szCs w:val="20"/>
               </w:rPr>
-              <w:t xml:space="preserve">uz.nixchat.common.music</w:t>
+              <w:t xml:space="preserve">uz.nchat.common.music</w:t>
             </w:r>
           </w:p>
         </w:tc>
@@ -1075,7 +1075,7 @@
                 <w:sz w:val="20"/>
                 <w:szCs w:val="20"/>
               </w:rPr>
-              <w:t xml:space="preserve">uz.nixchat.common.games</w:t>
+              <w:t xml:space="preserve">uz.nchat.common.games</w:t>
             </w:r>
           </w:p>
         </w:tc>
@@ -1132,7 +1132,7 @@
                 <w:sz w:val="20"/>
                 <w:szCs w:val="20"/>
               </w:rPr>
-              <w:t xml:space="preserve">NixStore mini-app catalog</w:t>
+              <w:t xml:space="preserve">NStore mini-app catalog</w:t>
             </w:r>
           </w:p>
         </w:tc>
@@ -1158,7 +1158,7 @@
                 <w:sz w:val="20"/>
                 <w:szCs w:val="20"/>
               </w:rPr>
-              <w:t xml:space="preserve">uz.nixchat.common.store</w:t>
+              <w:t xml:space="preserve">uz.nchat.common.store</w:t>
             </w:r>
           </w:p>
         </w:tc>
@@ -1244,7 +1244,7 @@
                 <w:sz w:val="20"/>
                 <w:szCs w:val="20"/>
               </w:rPr>
-              <w:t xml:space="preserve">uz.nixchat.common.crypto</w:t>
+              <w:t xml:space="preserve">uz.nchat.common.crypto</w:t>
             </w:r>
           </w:p>
         </w:tc>
@@ -1389,7 +1389,7 @@
         <w:spacing w:after="140" w:line="300"/>
       </w:pPr>
       <w:r>
-        <w:t xml:space="preserve">The Wallet Department runs NixCoin, the virtual currency of Nchat. Every new wallet starts with a welcome bonus of 100 NixCoin, and users can send coins to friends right from a chat, with a note such as “for pizza”.</w:t>
+        <w:t xml:space="preserve">The Wallet Department runs NCoin, the virtual currency of Nchat. Every new wallet starts with a welcome bonus of 100 NCoin, and users can send coins to friends right from a chat, with a note such as “for pizza”.</w:t>
       </w:r>
     </w:p>
     <w:p>
@@ -1746,7 +1746,7 @@
         <w:spacing w:after="140" w:line="300"/>
       </w:pPr>
       <w:r>
-        <w:t xml:space="preserve">The Store Department runs NixStore, the catalog of mini-apps and bots that work inside Nchat, similar to an app store on a phone. Users browse apps by category, search them by name or description, install and uninstall them.</w:t>
+        <w:t xml:space="preserve">The Store Department runs NStore, the catalog of mini-apps and bots that work inside Nchat, similar to an app store on a phone. Users browse apps by category, search them by name or description, install and uninstall them.</w:t>
       </w:r>
     </w:p>
     <w:p>
@@ -3423,7 +3423,7 @@
                 <w:sz w:val="20"/>
                 <w:szCs w:val="20"/>
               </w:rPr>
-              <w:t xml:space="preserve">uz.nixchat.client with ui, net, storage; uz.nixchat.common with model, wallet, music, games, store</w:t>
+              <w:t xml:space="preserve">uz.nchat.client with ui, net, storage; uz.nchat.common with model, wallet, music, games, store</w:t>
             </w:r>
           </w:p>
         </w:tc>

</xml_diff>